<commit_message>
Update v6 plan with feedback: contact-lead FK, dedup rules, reconciliation
- Explicit bidirectional FK: contacts.lead_id and leads.contact_id
- Dedup hierarchy: exact email > normalised phone > fuzzy name+company
- User-facing merge/skip/update options for fuzzy matches
- Start-of-day reconciliation for uncalled dispatched contacts
- Aircall Dialer Campaign API confirmed available
- dispatch_date field added to contacts schema

Co-Authored-By: Claude Opus 4.6 (1M context) <noreply@anthropic.com>
</commit_message>
<xml_diff>
--- a/docs/Operational_Readiness_Plan_v6.docx
+++ b/docs/Operational_Readiness_Plan_v6.docx
@@ -228,43 +228,43 @@
           <w:sz w:val="22"/>
           <w:szCs w:val="22"/>
         </w:rPr>
-        <w:t xml:space="preserve">contacts table — full pool. Name, phone, email, dispatch status, campaign, call outcomes. Every uploaded contact lives here.</w:t>
-      </w:r>
-    </w:p>
-    <w:p>
-      <w:pPr>
-        <w:pStyle w:val="ListParagraph"/>
-        <w:numPr>
-          <w:ilvl w:val="0"/>
-          <w:numId w:val="2"/>
-        </w:numPr>
-        <w:spacing w:after="60"/>
-      </w:pPr>
-      <w:r>
-        <w:rPr>
-          <w:rFonts w:ascii="Arial" w:cs="Arial" w:eastAsia="Arial" w:hAnsi="Arial"/>
-          <w:sz w:val="22"/>
-          <w:szCs w:val="22"/>
-        </w:rPr>
-        <w:t xml:space="preserve">leads table — intelligence layer. Linked to a contact when first transcript is analysed. Stores personas, beliefs, conversations, intelligence profiles.</w:t>
-      </w:r>
-    </w:p>
-    <w:p>
-      <w:pPr>
-        <w:pStyle w:val="ListParagraph"/>
-        <w:numPr>
-          <w:ilvl w:val="0"/>
-          <w:numId w:val="2"/>
-        </w:numPr>
-        <w:spacing w:after="60"/>
-      </w:pPr>
-      <w:r>
-        <w:rPr>
-          <w:rFonts w:ascii="Arial" w:cs="Arial" w:eastAsia="Arial" w:hAnsi="Arial"/>
-          <w:sz w:val="22"/>
-          <w:szCs w:val="22"/>
-        </w:rPr>
-        <w:t xml:space="preserve">A contact gets a linked lead record when their first call produces a transcript worth analysing.</w:t>
+        <w:t xml:space="preserve">contacts table — full pool. Name, phone, email, dispatch status, campaign, call outcomes. Every uploaded contact lives here. Has lead_id (FK to leads, nullable).</w:t>
+      </w:r>
+    </w:p>
+    <w:p>
+      <w:pPr>
+        <w:pStyle w:val="ListParagraph"/>
+        <w:numPr>
+          <w:ilvl w:val="0"/>
+          <w:numId w:val="2"/>
+        </w:numPr>
+        <w:spacing w:after="60"/>
+      </w:pPr>
+      <w:r>
+        <w:rPr>
+          <w:rFonts w:ascii="Arial" w:cs="Arial" w:eastAsia="Arial" w:hAnsi="Arial"/>
+          <w:sz w:val="22"/>
+          <w:szCs w:val="22"/>
+        </w:rPr>
+        <w:t xml:space="preserve">leads table — intelligence layer. Has contact_id (FK to contacts). Stores personas, beliefs, conversations, intelligence profiles.</w:t>
+      </w:r>
+    </w:p>
+    <w:p>
+      <w:pPr>
+        <w:pStyle w:val="ListParagraph"/>
+        <w:numPr>
+          <w:ilvl w:val="0"/>
+          <w:numId w:val="2"/>
+        </w:numPr>
+        <w:spacing w:after="60"/>
+      </w:pPr>
+      <w:r>
+        <w:rPr>
+          <w:rFonts w:ascii="Arial" w:cs="Arial" w:eastAsia="Arial" w:hAnsi="Arial"/>
+          <w:sz w:val="22"/>
+          <w:szCs w:val="22"/>
+        </w:rPr>
+        <w:t xml:space="preserve">A contact gets a linked lead record when their first call produces a transcript worth analysing. Both FKs are set at that point.</w:t>
       </w:r>
     </w:p>
     <w:p>
@@ -2068,6 +2068,42 @@
           <w:sz w:val="22"/>
           <w:szCs w:val="22"/>
         </w:rPr>
+        <w:t xml:space="preserve">Links: lead_id (FK to leads, nullable) — set when first transcript creates a lead record</w:t>
+      </w:r>
+    </w:p>
+    <w:p>
+      <w:pPr>
+        <w:pStyle w:val="ListParagraph"/>
+        <w:numPr>
+          <w:ilvl w:val="0"/>
+          <w:numId w:val="2"/>
+        </w:numPr>
+        <w:spacing w:after="60"/>
+      </w:pPr>
+      <w:r>
+        <w:rPr>
+          <w:rFonts w:ascii="Arial" w:cs="Arial" w:eastAsia="Arial" w:hAnsi="Arial"/>
+          <w:sz w:val="22"/>
+          <w:szCs w:val="22"/>
+        </w:rPr>
+        <w:t xml:space="preserve">Dispatch tracking: dispatch_date — when contact was last pushed to Aircall</w:t>
+      </w:r>
+    </w:p>
+    <w:p>
+      <w:pPr>
+        <w:pStyle w:val="ListParagraph"/>
+        <w:numPr>
+          <w:ilvl w:val="0"/>
+          <w:numId w:val="2"/>
+        </w:numPr>
+        <w:spacing w:after="60"/>
+      </w:pPr>
+      <w:r>
+        <w:rPr>
+          <w:rFonts w:ascii="Arial" w:cs="Arial" w:eastAsia="Arial" w:hAnsi="Arial"/>
+          <w:sz w:val="22"/>
+          <w:szCs w:val="22"/>
+        </w:rPr>
         <w:t xml:space="preserve">Timestamps: created_at, updated_at</w:t>
       </w:r>
     </w:p>
@@ -2081,7 +2117,22 @@
           <w:sz w:val="22"/>
           <w:szCs w:val="22"/>
         </w:rPr>
-        <w:t xml:space="preserve">Every contact starts in the app. External IDs are null until pushed to their respective systems.</w:t>
+        <w:t xml:space="preserve">Every contact starts in the app. External IDs and lead_id are null until their respective events occur.</w:t>
+      </w:r>
+    </w:p>
+    <w:p>
+      <w:pPr>
+        <w:spacing w:after="120"/>
+      </w:pPr>
+      <w:r>
+        <w:rPr>
+          <w:rFonts w:ascii="Arial" w:cs="Arial" w:eastAsia="Arial" w:hAnsi="Arial"/>
+          <w:b/>
+          <w:bCs/>
+          <w:sz w:val="22"/>
+          <w:szCs w:val="22"/>
+        </w:rPr>
+        <w:t xml:space="preserve">The leads table gets a corresponding contact_id (FK to contacts). Both FKs are set when a contact’s first transcript is analysed.</w:t>
       </w:r>
     </w:p>
     <w:p>
@@ -2161,43 +2212,7 @@
           <w:sz w:val="22"/>
           <w:szCs w:val="22"/>
         </w:rPr>
-        <w:t xml:space="preserve">Normalisation — phone format, email validation, name cleaning</w:t>
-      </w:r>
-    </w:p>
-    <w:p>
-      <w:pPr>
-        <w:pStyle w:val="ListParagraph"/>
-        <w:numPr>
-          <w:ilvl w:val="0"/>
-          <w:numId w:val="2"/>
-        </w:numPr>
-        <w:spacing w:after="60"/>
-      </w:pPr>
-      <w:r>
-        <w:rPr>
-          <w:rFonts w:ascii="Arial" w:cs="Arial" w:eastAsia="Arial" w:hAnsi="Arial"/>
-          <w:sz w:val="22"/>
-          <w:szCs w:val="22"/>
-        </w:rPr>
-        <w:t xml:space="preserve">Deduplication — match on email, phone, or fuzzy name+company against existing contacts</w:t>
-      </w:r>
-    </w:p>
-    <w:p>
-      <w:pPr>
-        <w:pStyle w:val="ListParagraph"/>
-        <w:numPr>
-          <w:ilvl w:val="0"/>
-          <w:numId w:val="2"/>
-        </w:numPr>
-        <w:spacing w:after="60"/>
-      </w:pPr>
-      <w:r>
-        <w:rPr>
-          <w:rFonts w:ascii="Arial" w:cs="Arial" w:eastAsia="Arial" w:hAnsi="Arial"/>
-          <w:sz w:val="22"/>
-          <w:szCs w:val="22"/>
-        </w:rPr>
-        <w:t xml:space="preserve">Preview — X new contacts, Y duplicates found, Z invalid (no phone)</w:t>
+        <w:t xml:space="preserve">Normalisation — phone format (E.164), email validation, name cleaning (trim, title case)</w:t>
       </w:r>
     </w:p>
     <w:p>
@@ -2234,6 +2249,169 @@
           <w:szCs w:val="22"/>
         </w:rPr>
         <w:t xml:space="preserve">Upload history showing all previous imports</w:t>
+      </w:r>
+    </w:p>
+    <w:p>
+      <w:pPr>
+        <w:pStyle w:val="Heading3"/>
+        <w:spacing w:after="120" w:before="200"/>
+      </w:pPr>
+      <w:r>
+        <w:rPr>
+          <w:rFonts w:ascii="Arial" w:cs="Arial" w:eastAsia="Arial" w:hAnsi="Arial"/>
+          <w:b/>
+          <w:bCs/>
+          <w:sz w:val="24"/>
+          <w:szCs w:val="24"/>
+        </w:rPr>
+        <w:t xml:space="preserve">Deduplication Rules</w:t>
+      </w:r>
+    </w:p>
+    <w:p>
+      <w:pPr>
+        <w:spacing w:after="120"/>
+      </w:pPr>
+      <w:r>
+        <w:rPr>
+          <w:rFonts w:ascii="Arial" w:cs="Arial" w:eastAsia="Arial" w:hAnsi="Arial"/>
+          <w:sz w:val="22"/>
+          <w:szCs w:val="22"/>
+        </w:rPr>
+        <w:t xml:space="preserve">Matching hierarchy (checked in order):</w:t>
+      </w:r>
+    </w:p>
+    <w:p>
+      <w:pPr>
+        <w:pStyle w:val="ListParagraph"/>
+        <w:numPr>
+          <w:ilvl w:val="0"/>
+          <w:numId w:val="2"/>
+        </w:numPr>
+        <w:spacing w:after="60"/>
+      </w:pPr>
+      <w:r>
+        <w:rPr>
+          <w:rFonts w:ascii="Arial" w:cs="Arial" w:eastAsia="Arial" w:hAnsi="Arial"/>
+          <w:sz w:val="22"/>
+          <w:szCs w:val="22"/>
+        </w:rPr>
+        <w:t xml:space="preserve">1. Exact email match — definite duplicate, auto-skip</w:t>
+      </w:r>
+    </w:p>
+    <w:p>
+      <w:pPr>
+        <w:pStyle w:val="ListParagraph"/>
+        <w:numPr>
+          <w:ilvl w:val="0"/>
+          <w:numId w:val="2"/>
+        </w:numPr>
+        <w:spacing w:after="60"/>
+      </w:pPr>
+      <w:r>
+        <w:rPr>
+          <w:rFonts w:ascii="Arial" w:cs="Arial" w:eastAsia="Arial" w:hAnsi="Arial"/>
+          <w:sz w:val="22"/>
+          <w:szCs w:val="22"/>
+        </w:rPr>
+        <w:t xml:space="preserve">2. Normalised phone match — definite duplicate, auto-skip</w:t>
+      </w:r>
+    </w:p>
+    <w:p>
+      <w:pPr>
+        <w:pStyle w:val="ListParagraph"/>
+        <w:numPr>
+          <w:ilvl w:val="0"/>
+          <w:numId w:val="2"/>
+        </w:numPr>
+        <w:spacing w:after="60"/>
+      </w:pPr>
+      <w:r>
+        <w:rPr>
+          <w:rFonts w:ascii="Arial" w:cs="Arial" w:eastAsia="Arial" w:hAnsi="Arial"/>
+          <w:sz w:val="22"/>
+          <w:szCs w:val="22"/>
+        </w:rPr>
+        <w:t xml:space="preserve">3. Fuzzy name + company match — possible duplicate, user decides</w:t>
+      </w:r>
+    </w:p>
+    <w:p>
+      <w:pPr>
+        <w:spacing w:after="120"/>
+      </w:pPr>
+      <w:r>
+        <w:rPr>
+          <w:rFonts w:ascii="Arial" w:cs="Arial" w:eastAsia="Arial" w:hAnsi="Arial"/>
+          <w:sz w:val="22"/>
+          <w:szCs w:val="22"/>
+        </w:rPr>
+        <w:t xml:space="preserve">Preview shows three categories:</w:t>
+      </w:r>
+    </w:p>
+    <w:p>
+      <w:pPr>
+        <w:pStyle w:val="ListParagraph"/>
+        <w:numPr>
+          <w:ilvl w:val="0"/>
+          <w:numId w:val="2"/>
+        </w:numPr>
+        <w:spacing w:after="60"/>
+      </w:pPr>
+      <w:r>
+        <w:rPr>
+          <w:rFonts w:ascii="Arial" w:cs="Arial" w:eastAsia="Arial" w:hAnsi="Arial"/>
+          <w:sz w:val="22"/>
+          <w:szCs w:val="22"/>
+        </w:rPr>
+        <w:t xml:space="preserve">X new contacts — no match found, will be imported</w:t>
+      </w:r>
+    </w:p>
+    <w:p>
+      <w:pPr>
+        <w:pStyle w:val="ListParagraph"/>
+        <w:numPr>
+          <w:ilvl w:val="0"/>
+          <w:numId w:val="2"/>
+        </w:numPr>
+        <w:spacing w:after="60"/>
+      </w:pPr>
+      <w:r>
+        <w:rPr>
+          <w:rFonts w:ascii="Arial" w:cs="Arial" w:eastAsia="Arial" w:hAnsi="Arial"/>
+          <w:sz w:val="22"/>
+          <w:szCs w:val="22"/>
+        </w:rPr>
+        <w:t xml:space="preserve">Y exact duplicates (email or phone match) — auto-skipped</w:t>
+      </w:r>
+    </w:p>
+    <w:p>
+      <w:pPr>
+        <w:pStyle w:val="ListParagraph"/>
+        <w:numPr>
+          <w:ilvl w:val="0"/>
+          <w:numId w:val="2"/>
+        </w:numPr>
+        <w:spacing w:after="60"/>
+      </w:pPr>
+      <w:r>
+        <w:rPr>
+          <w:rFonts w:ascii="Arial" w:cs="Arial" w:eastAsia="Arial" w:hAnsi="Arial"/>
+          <w:sz w:val="22"/>
+          <w:szCs w:val="22"/>
+        </w:rPr>
+        <w:t xml:space="preserve">Z possible matches (fuzzy name+company) — user chooses per row: Skip (ignore), Update (refresh contact details from newer CSV), or Merge (combine data from both records)</w:t>
+      </w:r>
+    </w:p>
+    <w:p>
+      <w:pPr>
+        <w:spacing w:after="120"/>
+      </w:pPr>
+      <w:r>
+        <w:rPr>
+          <w:rFonts w:ascii="Arial" w:cs="Arial" w:eastAsia="Arial" w:hAnsi="Arial"/>
+          <w:sz w:val="22"/>
+          <w:szCs w:val="22"/>
+        </w:rPr>
+        <w:t xml:space="preserve">The Update option is important: if someone moved company or changed phone, the newer CSV should be able to refresh their details without creating a duplicate.</w:t>
       </w:r>
     </w:p>
     <w:p>
@@ -2277,7 +2455,7 @@
           <w:sz w:val="22"/>
           <w:szCs w:val="22"/>
         </w:rPr>
-        <w:t xml:space="preserve">Thin API wrapper for pushing contacts to Aircall:</w:t>
+        <w:t xml:space="preserve">Thin API wrapper for pushing contacts to Aircall. Aircall Dialer Campaign API confirmed available (verified April 2026).</w:t>
       </w:r>
     </w:p>
     <w:p>
@@ -2344,7 +2522,7 @@
           <w:sz w:val="22"/>
           <w:szCs w:val="22"/>
         </w:rPr>
-        <w:t xml:space="preserve">Research Aircall Power Dialer API — contacts need to be created then added to a dialer campaign for a specific user.</w:t>
+        <w:t xml:space="preserve">Rate limit: 60 requests/minute per company. Batch dispatches need throttling for large campaigns.</w:t>
       </w:r>
     </w:p>
     <w:p>
@@ -2545,7 +2723,90 @@
           <w:sz w:val="22"/>
           <w:szCs w:val="22"/>
         </w:rPr>
-        <w:t xml:space="preserve">Mark as dispatched with today’s date</w:t>
+        <w:t xml:space="preserve">Mark as dispatched with dispatch_date = today</w:t>
+      </w:r>
+    </w:p>
+    <w:p>
+      <w:pPr>
+        <w:pStyle w:val="Heading3"/>
+        <w:spacing w:after="120" w:before="200"/>
+      </w:pPr>
+      <w:r>
+        <w:rPr>
+          <w:rFonts w:ascii="Arial" w:cs="Arial" w:eastAsia="Arial" w:hAnsi="Arial"/>
+          <w:b/>
+          <w:bCs/>
+          <w:sz w:val="24"/>
+          <w:szCs w:val="24"/>
+        </w:rPr>
+        <w:t xml:space="preserve">Uncalled Contact Reconciliation</w:t>
+      </w:r>
+    </w:p>
+    <w:p>
+      <w:pPr>
+        <w:spacing w:after="120"/>
+      </w:pPr>
+      <w:r>
+        <w:rPr>
+          <w:rFonts w:ascii="Arial" w:cs="Arial" w:eastAsia="Arial" w:hAnsi="Arial"/>
+          <w:sz w:val="22"/>
+          <w:szCs w:val="22"/>
+        </w:rPr>
+        <w:t xml:space="preserve">Contacts dispatched to Aircall but not called need to be detected and returned to the queue:</w:t>
+      </w:r>
+    </w:p>
+    <w:p>
+      <w:pPr>
+        <w:pStyle w:val="ListParagraph"/>
+        <w:numPr>
+          <w:ilvl w:val="0"/>
+          <w:numId w:val="2"/>
+        </w:numPr>
+        <w:spacing w:after="60"/>
+      </w:pPr>
+      <w:r>
+        <w:rPr>
+          <w:rFonts w:ascii="Arial" w:cs="Arial" w:eastAsia="Arial" w:hAnsi="Arial"/>
+          <w:sz w:val="22"/>
+          <w:szCs w:val="22"/>
+        </w:rPr>
+        <w:t xml:space="preserve">Start-of-day reconciliation: any contact with dispatch_status = ‘dispatched’ and dispatch_date = yesterday with no corresponding call record gets reset to ‘queued’</w:t>
+      </w:r>
+    </w:p>
+    <w:p>
+      <w:pPr>
+        <w:pStyle w:val="ListParagraph"/>
+        <w:numPr>
+          <w:ilvl w:val="0"/>
+          <w:numId w:val="2"/>
+        </w:numPr>
+        <w:spacing w:after="60"/>
+      </w:pPr>
+      <w:r>
+        <w:rPr>
+          <w:rFonts w:ascii="Arial" w:cs="Arial" w:eastAsia="Arial" w:hAnsi="Arial"/>
+          <w:sz w:val="22"/>
+          <w:szCs w:val="22"/>
+        </w:rPr>
+        <w:t xml:space="preserve">Detection method: check lead_conversations table for a record matching this contact on dispatch_date. No record = not called.</w:t>
+      </w:r>
+    </w:p>
+    <w:p>
+      <w:pPr>
+        <w:pStyle w:val="ListParagraph"/>
+        <w:numPr>
+          <w:ilvl w:val="0"/>
+          <w:numId w:val="2"/>
+        </w:numPr>
+        <w:spacing w:after="60"/>
+      </w:pPr>
+      <w:r>
+        <w:rPr>
+          <w:rFonts w:ascii="Arial" w:cs="Arial" w:eastAsia="Arial" w:hAnsi="Arial"/>
+          <w:sz w:val="22"/>
+          <w:szCs w:val="22"/>
+        </w:rPr>
+        <w:t xml:space="preserve">These contacts re-enter the pool for the next dispatch cycle without counting against call_attempts</w:t>
       </w:r>
     </w:p>
     <w:p>

</xml_diff>